<commit_message>
Name the pledge wherever candidate records are listed
The candidate notice templates, the instructions for companies and the
terms' fair-use rule list what is recorded about a candidate in an
interview, and none named the new pledge to answer on their own. Each
now does, so a company's notice and prepza's own documents match what
is kept. The terms' 2026-11-08 version isn't in force yet, so it
changes in place in every language; the downloads are rebuilt.

Co-Authored-By: Claude Opus 5.5 <noreply@anthropic.com>
</commit_message>
<xml_diff>
--- a/frontend/public/documents/prepza-candidate-notice-templates.docx
+++ b/frontend/public/documents/prepza-candidate-notice-templates.docx
@@ -270,7 +270,19 @@
         <w:t xml:space="preserve"> </w:t>
       </w:r>
       <w:r>
-        <w:t xml:space="preserve">read the question; [Company] may give you extra time, which is recorded without a reason.</w:t>
+        <w:t xml:space="preserve">read the question. Before you start, you confirm that you’ll answer on your own, without AI tools</w:t>
+      </w:r>
+      <w:r>
+        <w:t xml:space="preserve"> </w:t>
+      </w:r>
+      <w:r>
+        <w:t xml:space="preserve">or other people, and when you did is recorded. [Company] may give you extra time, which is</w:t>
+      </w:r>
+      <w:r>
+        <w:t xml:space="preserve"> </w:t>
+      </w:r>
+      <w:r>
+        <w:t xml:space="preserve">recorded without a reason.</w:t>
       </w:r>
     </w:p>
     <w:p>
@@ -330,13 +342,13 @@
         <w:t xml:space="preserve"> </w:t>
       </w:r>
       <w:r>
-        <w:t xml:space="preserve">leaves, copy attempts, answers too fast to have read the question, and any extra time you were</w:t>
-      </w:r>
-      <w:r>
-        <w:t xml:space="preserve"> </w:t>
-      </w:r>
-      <w:r>
-        <w:t xml:space="preserve">given. The questions were written with AI from the job description,</w:t>
+        <w:t xml:space="preserve">leaves, copy attempts, answers too fast to have read the question, when you confirmed answering</w:t>
+      </w:r>
+      <w:r>
+        <w:t xml:space="preserve"> </w:t>
+      </w:r>
+      <w:r>
+        <w:t xml:space="preserve">on your own, and any extra time you were given. The questions were written with AI from the job description,</w:t>
       </w:r>
       <w:r>
         <w:t xml:space="preserve"> </w:t>
@@ -577,13 +589,13 @@
         <w:t xml:space="preserve"> </w:t>
       </w:r>
       <w:r>
-        <w:t xml:space="preserve">too fast to have read the question. If we give you extra time, that is recorded too, without a</w:t>
-      </w:r>
-      <w:r>
-        <w:t xml:space="preserve"> </w:t>
-      </w:r>
-      <w:r>
-        <w:t xml:space="preserve">reason. You won’t see your score.</w:t>
+        <w:t xml:space="preserve">too fast to have read the question, and when you confirmed, before starting, that you’d answer</w:t>
+      </w:r>
+      <w:r>
+        <w:t xml:space="preserve"> </w:t>
+      </w:r>
+      <w:r>
+        <w:t xml:space="preserve">on your own. If we give you extra time, that is recorded too, without a reason. You won’t see your score.</w:t>
       </w:r>
     </w:p>
     <w:p>

</xml_diff>

<commit_message>
Guide companies on voice mode, Discover, UK and US
Companies' documents didn't mention voice mode (the DPIA template
even said no voice is collected), the Discover tab, or what the UK
and US laws ask of them. The DPIA template now covers voice mode's
risks, answer patterns, notes and Discover; the instructions add the
UK (UK GDPR, Equality Act, ICO guidance) and US duties (EEOC, NYC,
Illinois, Colorado, California) with their record-keeping periods;
the notice templates add voice mode and Illinois and Colorado notices.

Co-Authored-By: Claude Opus 5.5 <noreply@anthropic.com>
</commit_message>
<xml_diff>
--- a/frontend/public/documents/prepza-candidate-notice-templates.docx
+++ b/frontend/public/documents/prepza-candidate-notice-templates.docx
@@ -2,7 +2,7 @@
 <file path=word/document.xml><?xml version="1.0" encoding="utf-8"?>
 <w:document xmlns:w="http://schemas.openxmlformats.org/wordprocessingml/2006/main" xmlns:m="http://schemas.openxmlformats.org/officeDocument/2006/math" xmlns:r="http://schemas.openxmlformats.org/officeDocument/2006/relationships" xmlns:o="urn:schemas-microsoft-com:office:office" xmlns:v="urn:schemas-microsoft-com:vml" xmlns:w10="urn:schemas-microsoft-com:office:word" xmlns:a="http://schemas.openxmlformats.org/drawingml/2006/main" xmlns:pic="http://schemas.openxmlformats.org/drawingml/2006/picture" xmlns:wp="http://schemas.openxmlformats.org/drawingml/2006/wordprocessingDrawing">
   <w:body>
-    <w:bookmarkStart w:id="12" w:name="candidate-notice-templates"/>
+    <w:bookmarkStart w:id="14" w:name="candidate-notice-templates"/>
     <w:p>
       <w:pPr>
         <w:pStyle w:val="Heading1"/>
@@ -16,7 +16,7 @@
         <w:pStyle w:val="FirstParagraph"/>
       </w:pPr>
       <w:r>
-        <w:t xml:space="preserve">Version of 2026-10-17. Arcolabs OÜ (registry code 17587452), Sepapaja tn 6, 15551 Tallinn, Estonia; hello@prepza.ai.</w:t>
+        <w:t xml:space="preserve">Version of 2026-10-30. Arcolabs OÜ (registry code 17587452), Sepapaja tn 6, 15551 Tallinn, Estonia; hello@prepza.ai.</w:t>
       </w:r>
     </w:p>
     <w:p>
@@ -64,7 +64,13 @@
         <w:t xml:space="preserve"> </w:t>
       </w:r>
       <w:r>
-        <w:t xml:space="preserve">general notice (section 2) does it.</w:t>
+        <w:t xml:space="preserve">general notice (section 2) does it. Illinois and Colorado candidates get the general notice with</w:t>
+      </w:r>
+      <w:r>
+        <w:t xml:space="preserve"> </w:t>
+      </w:r>
+      <w:r>
+        <w:t xml:space="preserve">the state wording in sections 4 and 5 added.</w:t>
       </w:r>
     </w:p>
     <w:bookmarkStart w:id="9" w:name="X326a768412094e7498f210d3703b6e2890fc1af"/>
@@ -228,61 +234,79 @@
         <w:t xml:space="preserve"> </w:t>
       </w:r>
       <w:r>
-        <w:t xml:space="preserve">the job’s requirements: [list topics]. Each question has a time limit of [N] seconds. Your score</w:t>
-      </w:r>
-      <w:r>
-        <w:t xml:space="preserve"> </w:t>
-      </w:r>
-      <w:r>
-        <w:t xml:space="preserve">is the percentage of points earned: each question is worth one point, and on a</w:t>
-      </w:r>
-      <w:r>
-        <w:t xml:space="preserve"> </w:t>
-      </w:r>
-      <w:r>
-        <w:t xml:space="preserve">“select all that</w:t>
-      </w:r>
-      <w:r>
-        <w:t xml:space="preserve"> </w:t>
-      </w:r>
-      <w:r>
-        <w:t xml:space="preserve">apply”</w:t>
-      </w:r>
-      <w:r>
-        <w:t xml:space="preserve"> </w:t>
-      </w:r>
-      <w:r>
-        <w:t xml:space="preserve">question you earn part of it for each right option ticked, and nothing if you tick a</w:t>
-      </w:r>
-      <w:r>
-        <w:t xml:space="preserve"> </w:t>
-      </w:r>
-      <w:r>
-        <w:t xml:space="preserve">wrong one. The tool also records how long each answer</w:t>
-      </w:r>
-      <w:r>
-        <w:t xml:space="preserve"> </w:t>
-      </w:r>
-      <w:r>
-        <w:t xml:space="preserve">took, when you left the test page or copied text during it, and answers given too fast to have</w:t>
-      </w:r>
-      <w:r>
-        <w:t xml:space="preserve"> </w:t>
-      </w:r>
-      <w:r>
-        <w:t xml:space="preserve">read the question. Before you start, you confirm that you’ll answer on your own, without AI tools</w:t>
-      </w:r>
-      <w:r>
-        <w:t xml:space="preserve"> </w:t>
-      </w:r>
-      <w:r>
-        <w:t xml:space="preserve">or other people, and when you did is recorded. [Company] may give you extra time, which is</w:t>
-      </w:r>
-      <w:r>
-        <w:t xml:space="preserve"> </w:t>
-      </w:r>
-      <w:r>
-        <w:t xml:space="preserve">recorded without a reason.</w:t>
+        <w:t xml:space="preserve">the job’s requirements: [list topics]. Each question has its own time limit, on average [N]</w:t>
+      </w:r>
+      <w:r>
+        <w:t xml:space="preserve"> </w:t>
+      </w:r>
+      <w:r>
+        <w:t xml:space="preserve">seconds: shorter questions get less, longer ones and code more. Your score is the percentage</w:t>
+      </w:r>
+      <w:r>
+        <w:t xml:space="preserve"> </w:t>
+      </w:r>
+      <w:r>
+        <w:t xml:space="preserve">of points earned: each question is worth one point, and on a</w:t>
+      </w:r>
+      <w:r>
+        <w:t xml:space="preserve"> </w:t>
+      </w:r>
+      <w:r>
+        <w:t xml:space="preserve">“select all that apply”</w:t>
+      </w:r>
+      <w:r>
+        <w:t xml:space="preserve"> </w:t>
+      </w:r>
+      <w:r>
+        <w:t xml:space="preserve">question</w:t>
+      </w:r>
+      <w:r>
+        <w:t xml:space="preserve"> </w:t>
+      </w:r>
+      <w:r>
+        <w:t xml:space="preserve">you earn part of it for each right option ticked, and nothing if you tick a wrong one. The tool</w:t>
+      </w:r>
+      <w:r>
+        <w:t xml:space="preserve"> </w:t>
+      </w:r>
+      <w:r>
+        <w:t xml:space="preserve">also records how long each answer took, when you left the test page or copied text during it,</w:t>
+      </w:r>
+      <w:r>
+        <w:t xml:space="preserve"> </w:t>
+      </w:r>
+      <w:r>
+        <w:t xml:space="preserve">and answers given too fast to have read the question. It also shows [Company] when your answer</w:t>
+      </w:r>
+      <w:r>
+        <w:t xml:space="preserve"> </w:t>
+      </w:r>
+      <w:r>
+        <w:t xml:space="preserve">times or your right and wrong answers don’t follow the questions’ length and difficulty as other</w:t>
+      </w:r>
+      <w:r>
+        <w:t xml:space="preserve"> </w:t>
+      </w:r>
+      <w:r>
+        <w:t xml:space="preserve">candidates’ do (for example, about the same time on every question), with questions to ask you</w:t>
+      </w:r>
+      <w:r>
+        <w:t xml:space="preserve"> </w:t>
+      </w:r>
+      <w:r>
+        <w:t xml:space="preserve">about in an interview; it never decides on its own. Before you start, you confirm that you’ll</w:t>
+      </w:r>
+      <w:r>
+        <w:t xml:space="preserve"> </w:t>
+      </w:r>
+      <w:r>
+        <w:t xml:space="preserve">answer on your own, without AI tools or other people, and when you did is recorded. [Company]</w:t>
+      </w:r>
+      <w:r>
+        <w:t xml:space="preserve"> </w:t>
+      </w:r>
+      <w:r>
+        <w:t xml:space="preserve">may give you extra time, which is recorded without a reason.</w:t>
       </w:r>
     </w:p>
     <w:p>
@@ -511,7 +535,13 @@
         <w:t xml:space="preserve"> </w:t>
       </w:r>
       <w:r>
-        <w:t xml:space="preserve">high-risk AI system. [N] multiple-choice questions about [topics], with [N] seconds for each.</w:t>
+        <w:t xml:space="preserve">high-risk AI system. [N] multiple-choice questions about [topics], with on average [N] seconds</w:t>
+      </w:r>
+      <w:r>
+        <w:t xml:space="preserve"> </w:t>
+      </w:r>
+      <w:r>
+        <w:t xml:space="preserve">for each; each question shows its own timer.</w:t>
       </w:r>
       <w:r>
         <w:t xml:space="preserve"> </w:t>
@@ -595,7 +625,73 @@
         <w:t xml:space="preserve"> </w:t>
       </w:r>
       <w:r>
-        <w:t xml:space="preserve">on your own. If we give you extra time, that is recorded too, without a reason. You won’t see your score.</w:t>
+        <w:t xml:space="preserve">on your own. If we give you extra time, that is recorded too, without a reason. We’re also shown</w:t>
+      </w:r>
+      <w:r>
+        <w:t xml:space="preserve"> </w:t>
+      </w:r>
+      <w:r>
+        <w:t xml:space="preserve">when your answer times or your right and wrong answers don’t follow the questions’ length and</w:t>
+      </w:r>
+      <w:r>
+        <w:t xml:space="preserve"> </w:t>
+      </w:r>
+      <w:r>
+        <w:t xml:space="preserve">difficulty as other candidates’ do, with questions to ask you about; it’s a reason to ask, never</w:t>
+      </w:r>
+      <w:r>
+        <w:t xml:space="preserve"> </w:t>
+      </w:r>
+      <w:r>
+        <w:t xml:space="preserve">a decision. You won’t see your score.</w:t>
+      </w:r>
+    </w:p>
+    <w:p>
+      <w:pPr>
+        <w:pStyle w:val="BlockText"/>
+      </w:pPr>
+      <w:r>
+        <w:t xml:space="preserve">[Voice mode only:]</w:t>
+      </w:r>
+      <w:r>
+        <w:t xml:space="preserve"> </w:t>
+      </w:r>
+      <w:r>
+        <w:rPr>
+          <w:b/>
+          <w:bCs/>
+        </w:rPr>
+        <w:t xml:space="preserve">Answering aloud.</w:t>
+      </w:r>
+      <w:r>
+        <w:t xml:space="preserve"> </w:t>
+      </w:r>
+      <w:r>
+        <w:t xml:space="preserve">The questions and their options are read aloud and you</w:t>
+      </w:r>
+      <w:r>
+        <w:t xml:space="preserve"> </w:t>
+      </w:r>
+      <w:r>
+        <w:t xml:space="preserve">can answer aloud. What the microphone picks up while you answer is turned into text by AI and</w:t>
+      </w:r>
+      <w:r>
+        <w:t xml:space="preserve"> </w:t>
+      </w:r>
+      <w:r>
+        <w:t xml:space="preserve">matched to an option, which you confirm before it counts; it is never recorded or stored, and</w:t>
+      </w:r>
+      <w:r>
+        <w:t xml:space="preserve"> </w:t>
+      </w:r>
+      <w:r>
+        <w:t xml:space="preserve">your voice isn’t analysed in any other way. You can always tap an option instead, or ask us at</w:t>
+      </w:r>
+      <w:r>
+        <w:t xml:space="preserve"> </w:t>
+      </w:r>
+      <w:r>
+        <w:t xml:space="preserve">[contact] for the test without voice.</w:t>
       </w:r>
     </w:p>
     <w:p>
@@ -803,7 +899,195 @@
       </w:r>
     </w:p>
     <w:bookmarkEnd w:id="11"/>
+    <w:bookmarkStart w:id="12" w:name="Xdae06103dbfb5d6661d349017e45b915fed7a1f"/>
+    <w:p>
+      <w:pPr>
+        <w:pStyle w:val="Heading2"/>
+      </w:pPr>
+      <w:r>
+        <w:t xml:space="preserve">4. Illinois (Human Rights Act, AI in employment)</w:t>
+      </w:r>
+    </w:p>
+    <w:p>
+      <w:pPr>
+        <w:pStyle w:val="FirstParagraph"/>
+      </w:pPr>
+      <w:r>
+        <w:t xml:space="preserve">Add to the general notice for candidates in Illinois, from 2026-01-01:</w:t>
+      </w:r>
+    </w:p>
+    <w:p>
+      <w:pPr>
+        <w:pStyle w:val="BlockText"/>
+      </w:pPr>
+      <w:r>
+        <w:rPr>
+          <w:b/>
+          <w:bCs/>
+        </w:rPr>
+        <w:t xml:space="preserve">Use of artificial intelligence (Illinois).</w:t>
+      </w:r>
+      <w:r>
+        <w:t xml:space="preserve"> </w:t>
+      </w:r>
+      <w:r>
+        <w:t xml:space="preserve">[Company] uses artificial intelligence in</w:t>
+      </w:r>
+      <w:r>
+        <w:t xml:space="preserve"> </w:t>
+      </w:r>
+      <w:r>
+        <w:t xml:space="preserve">recruitment and hiring for [job title]: prepza, a timed knowledge test whose questions and answer</w:t>
+      </w:r>
+      <w:r>
+        <w:t xml:space="preserve"> </w:t>
+      </w:r>
+      <w:r>
+        <w:t xml:space="preserve">keys were written with the help of AI and which gives each candidate a grade. We use the grade</w:t>
+      </w:r>
+      <w:r>
+        <w:t xml:space="preserve"> </w:t>
+      </w:r>
+      <w:r>
+        <w:t xml:space="preserve">to [decide whom to invite to the next interview / as one part of our assessment]. It doesn’t use</w:t>
+      </w:r>
+      <w:r>
+        <w:t xml:space="preserve"> </w:t>
+      </w:r>
+      <w:r>
+        <w:t xml:space="preserve">your age, race, sex, disability, zip code or any other protected characteristic, or a proxy for</w:t>
+      </w:r>
+      <w:r>
+        <w:t xml:space="preserve"> </w:t>
+      </w:r>
+      <w:r>
+        <w:t xml:space="preserve">one. A person at [Company] reviews every result. Questions, an accommodation or a human review:</w:t>
+      </w:r>
+      <w:r>
+        <w:t xml:space="preserve"> </w:t>
+      </w:r>
+      <w:r>
+        <w:t xml:space="preserve">[contact].</w:t>
+      </w:r>
+    </w:p>
     <w:bookmarkEnd w:id="12"/>
+    <w:bookmarkStart w:id="13" w:name="colorado-its-ai-law-from-2027-01-01"/>
+    <w:p>
+      <w:pPr>
+        <w:pStyle w:val="Heading2"/>
+      </w:pPr>
+      <w:r>
+        <w:t xml:space="preserve">5. Colorado (its AI law, from 2027-01-01)</w:t>
+      </w:r>
+    </w:p>
+    <w:p>
+      <w:pPr>
+        <w:pStyle w:val="FirstParagraph"/>
+      </w:pPr>
+      <w:r>
+        <w:t xml:space="preserve">Before the test, add to the general notice for candidates who live in Colorado:</w:t>
+      </w:r>
+    </w:p>
+    <w:p>
+      <w:pPr>
+        <w:pStyle w:val="BlockText"/>
+      </w:pPr>
+      <w:r>
+        <w:rPr>
+          <w:b/>
+          <w:bCs/>
+        </w:rPr>
+        <w:t xml:space="preserve">Automated decision-making technology (Colorado).</w:t>
+      </w:r>
+      <w:r>
+        <w:t xml:space="preserve"> </w:t>
+      </w:r>
+      <w:r>
+        <w:t xml:space="preserve">[Company] uses prepza, technology that</w:t>
+      </w:r>
+      <w:r>
+        <w:t xml:space="preserve"> </w:t>
+      </w:r>
+      <w:r>
+        <w:t xml:space="preserve">grades a timed knowledge test with answer keys written with the help of AI, and the grade</w:t>
+      </w:r>
+      <w:r>
+        <w:t xml:space="preserve"> </w:t>
+      </w:r>
+      <w:r>
+        <w:t xml:space="preserve">[materially influences / is one part of] our decision about [job title]. To learn more about the</w:t>
+      </w:r>
+      <w:r>
+        <w:t xml:space="preserve"> </w:t>
+      </w:r>
+      <w:r>
+        <w:t xml:space="preserve">technology, the data it uses and your rights, write to [contact] or see [link].</w:t>
+      </w:r>
+    </w:p>
+    <w:p>
+      <w:pPr>
+        <w:pStyle w:val="FirstParagraph"/>
+      </w:pPr>
+      <w:r>
+        <w:t xml:space="preserve">If the outcome is adverse (not hired, or not invited onward), send within 30 days:</w:t>
+      </w:r>
+    </w:p>
+    <w:p>
+      <w:pPr>
+        <w:pStyle w:val="BlockText"/>
+      </w:pPr>
+      <w:r>
+        <w:rPr>
+          <w:b/>
+          <w:bCs/>
+        </w:rPr>
+        <w:t xml:space="preserve">About our decision (Colorado).</w:t>
+      </w:r>
+      <w:r>
+        <w:t xml:space="preserve"> </w:t>
+      </w:r>
+      <w:r>
+        <w:t xml:space="preserve">We decided [not to move your application forward] for</w:t>
+      </w:r>
+      <w:r>
+        <w:t xml:space="preserve"> </w:t>
+      </w:r>
+      <w:r>
+        <w:t xml:space="preserve">[job title]. prepza’s grade of your knowledge test [describe its role, e.g. was below our passing</w:t>
+      </w:r>
+      <w:r>
+        <w:t xml:space="preserve"> </w:t>
+      </w:r>
+      <w:r>
+        <w:t xml:space="preserve">grade of N%, which we weighed with your interview]. The system is prepza (Arcolabs OÜ, version</w:t>
+      </w:r>
+      <w:r>
+        <w:t xml:space="preserve"> </w:t>
+      </w:r>
+      <w:r>
+        <w:t xml:space="preserve">as used on [date]); it used your answers, how long each took and the integrity signals described</w:t>
+      </w:r>
+      <w:r>
+        <w:t xml:space="preserve"> </w:t>
+      </w:r>
+      <w:r>
+        <w:t xml:space="preserve">in our notice, all from your test, and your name and email from your application. You can ask us</w:t>
+      </w:r>
+      <w:r>
+        <w:t xml:space="preserve"> </w:t>
+      </w:r>
+      <w:r>
+        <w:t xml:space="preserve">to correct any of this data, and ask a person to review and reconsider the decision, at</w:t>
+      </w:r>
+      <w:r>
+        <w:t xml:space="preserve"> </w:t>
+      </w:r>
+      <w:r>
+        <w:t xml:space="preserve">[contact] by [date].</w:t>
+      </w:r>
+    </w:p>
+    <w:bookmarkEnd w:id="13"/>
+    <w:bookmarkEnd w:id="14"/>
     <w:sectPr>
       <w:footnotePr>
         <w:numRestart w:val="eachSect"/>

</xml_diff>